<commit_message>
updated due date errors
</commit_message>
<xml_diff>
--- a/syllabus/Community Ecology Syllabus 2026.docx
+++ b/syllabus/Community Ecology Syllabus 2026.docx
@@ -2313,7 +2313,7 @@
     <w:sdt>
       <w:sdtPr>
         <w:lock w:val="contentLocked"/>
-        <w:id w:val="169473526"/>
+        <w:id w:val="-1773602878"/>
         <w:tag w:val="goog_rdk_0"/>
       </w:sdtPr>
       <w:sdtContent>
@@ -5270,7 +5270,7 @@
                     <w:szCs w:val="22"/>
                     <w:rtl w:val="0"/>
                   </w:rPr>
-                  <w:t xml:space="preserve">March 26 W</w:t>
+                  <w:t xml:space="preserve">March 25 W</w:t>
                 </w:r>
               </w:p>
             </w:tc>
@@ -6821,7 +6821,7 @@
                     <w:szCs w:val="22"/>
                     <w:rtl w:val="0"/>
                   </w:rPr>
-                  <w:t xml:space="preserve">Project 4 (due Friday)</w:t>
+                  <w:t xml:space="preserve">Project 4 (due Thursday, the end of the term)</w:t>
                 </w:r>
                 <w:r>
                   <w:rPr>
@@ -8032,7 +8032,7 @@
           <w:rtl w:val="0"/>
         </w:rPr>
         <w:tab/>
-        <w:t xml:space="preserve">Use AI sensibly, if at all.  The goal of this course is to teach you, and using AI to write your assignments negates that learning.  It’s also still pretty bad at a lot of community ecology stuff. While generative AI should not be used to write any assignments,  there are permissible uses for it.  For example, ChatGPT can be used to help identify papers to read (but use caution! It likes to make up papers that don’t actually exist), or AI tools could generate images for use within a conceptual figure. In all cases, any use of AI must be cited. If you have questions about permissible use of AI, just ask.</w:t>
+        <w:t xml:space="preserve">Use AI sensibly, if at all.  The goal of this course is to teach you, and using AI to write your assignments negates that learning.  It’s also still pretty bad at a lot of community ecology stuff. While generative AI should not be used to write any assignments,  there are permissible uses for it.  For example, ChatGPT can be used to help identify potential papers to read (but use caution! It likes to make up papers that don’t actually exist). In all cases, any use of AI must be cited. If you have questions about permissible use of AI, just ask.</w:t>
       </w:r>
     </w:p>
     <w:p>

</xml_diff>

<commit_message>
added recommended readings for first half of semester
</commit_message>
<xml_diff>
--- a/syllabus/Community Ecology Syllabus 2026.docx
+++ b/syllabus/Community Ecology Syllabus 2026.docx
@@ -2313,7 +2313,7 @@
     <w:sdt>
       <w:sdtPr>
         <w:lock w:val="contentLocked"/>
-        <w:id w:val="-1773602878"/>
+        <w:id w:val="280246434"/>
         <w:tag w:val="goog_rdk_0"/>
       </w:sdtPr>
       <w:sdtContent>
@@ -2605,16 +2605,18 @@
                   <w:widowControl w:val="0"/>
                   <w:rPr>
                     <w:rFonts w:ascii="Arial" w:cs="Arial" w:eastAsia="Arial" w:hAnsi="Arial"/>
-                    <w:b w:val="1"/>
-                    <w:bCs w:val="1"/>
-                    <w:sz w:val="22"/>
-                    <w:szCs w:val="22"/>
-                  </w:rPr>
-                </w:pPr>
-                <w:r>
-                  <w:rPr>
-                    <w:rtl w:val="0"/>
-                  </w:rPr>
+                    <w:sz w:val="22"/>
+                    <w:szCs w:val="22"/>
+                  </w:rPr>
+                </w:pPr>
+                <w:r>
+                  <w:rPr>
+                    <w:rFonts w:ascii="Arial" w:cs="Arial" w:eastAsia="Arial" w:hAnsi="Arial"/>
+                    <w:sz w:val="22"/>
+                    <w:szCs w:val="22"/>
+                    <w:rtl w:val="0"/>
+                  </w:rPr>
+                  <w:t xml:space="preserve">Read Chapter 1</w:t>
                 </w:r>
               </w:p>
             </w:tc>
@@ -2801,6 +2803,15 @@
                 </w:pPr>
                 <w:r>
                   <w:rPr>
+                    <w:rFonts w:ascii="Arial" w:cs="Arial" w:eastAsia="Arial" w:hAnsi="Arial"/>
+                    <w:sz w:val="22"/>
+                    <w:szCs w:val="22"/>
+                    <w:rtl w:val="0"/>
+                  </w:rPr>
+                  <w:t xml:space="preserve">Read pages 11 - 18</w:t>
+                </w:r>
+                <w:r>
+                  <w:rPr>
                     <w:rtl w:val="0"/>
                   </w:rPr>
                 </w:r>
@@ -3060,6 +3071,15 @@
                 </w:pPr>
                 <w:r>
                   <w:rPr>
+                    <w:rFonts w:ascii="Arial" w:cs="Arial" w:eastAsia="Arial" w:hAnsi="Arial"/>
+                    <w:sz w:val="22"/>
+                    <w:szCs w:val="22"/>
+                    <w:rtl w:val="0"/>
+                  </w:rPr>
+                  <w:t xml:space="preserve">Read pages 18 - 25</w:t>
+                </w:r>
+                <w:r>
+                  <w:rPr>
                     <w:rtl w:val="0"/>
                   </w:rPr>
                 </w:r>
@@ -3194,6 +3214,15 @@
                 </w:pPr>
                 <w:r>
                   <w:rPr>
+                    <w:rFonts w:ascii="Arial" w:cs="Arial" w:eastAsia="Arial" w:hAnsi="Arial"/>
+                    <w:sz w:val="22"/>
+                    <w:szCs w:val="22"/>
+                    <w:rtl w:val="0"/>
+                  </w:rPr>
+                  <w:t xml:space="preserve">Read pages 25 - 37</w:t>
+                </w:r>
+                <w:r>
+                  <w:rPr>
                     <w:rtl w:val="0"/>
                   </w:rPr>
                 </w:r>
@@ -3527,6 +3556,15 @@
                 </w:pPr>
                 <w:r>
                   <w:rPr>
+                    <w:rFonts w:ascii="Arial" w:cs="Arial" w:eastAsia="Arial" w:hAnsi="Arial"/>
+                    <w:sz w:val="22"/>
+                    <w:szCs w:val="22"/>
+                    <w:rtl w:val="0"/>
+                  </w:rPr>
+                  <w:t xml:space="preserve">Read pages 38 - 52</w:t>
+                </w:r>
+                <w:r>
+                  <w:rPr>
                     <w:rtl w:val="0"/>
                   </w:rPr>
                 </w:r>
@@ -3664,6 +3702,25 @@
                   <w:t xml:space="preserve">Project 1 (due Friday)</w:t>
                 </w:r>
               </w:p>
+              <w:p>
+                <w:pPr>
+                  <w:widowControl w:val="0"/>
+                  <w:rPr>
+                    <w:rFonts w:ascii="Arial" w:cs="Arial" w:eastAsia="Arial" w:hAnsi="Arial"/>
+                    <w:sz w:val="22"/>
+                    <w:szCs w:val="22"/>
+                  </w:rPr>
+                </w:pPr>
+                <w:r>
+                  <w:rPr>
+                    <w:rFonts w:ascii="Arial" w:cs="Arial" w:eastAsia="Arial" w:hAnsi="Arial"/>
+                    <w:sz w:val="22"/>
+                    <w:szCs w:val="22"/>
+                    <w:rtl w:val="0"/>
+                  </w:rPr>
+                  <w:t xml:space="preserve">Read pages 52 - 60</w:t>
+                </w:r>
+              </w:p>
             </w:tc>
           </w:tr>
           <w:tr>
@@ -3777,16 +3834,18 @@
                   <w:widowControl w:val="0"/>
                   <w:rPr>
                     <w:rFonts w:ascii="Arial" w:cs="Arial" w:eastAsia="Arial" w:hAnsi="Arial"/>
-                    <w:b w:val="1"/>
-                    <w:bCs w:val="1"/>
-                    <w:sz w:val="22"/>
-                    <w:szCs w:val="22"/>
-                  </w:rPr>
-                </w:pPr>
-                <w:r>
-                  <w:rPr>
-                    <w:rtl w:val="0"/>
-                  </w:rPr>
+                    <w:sz w:val="22"/>
+                    <w:szCs w:val="22"/>
+                  </w:rPr>
+                </w:pPr>
+                <w:r>
+                  <w:rPr>
+                    <w:rFonts w:ascii="Arial" w:cs="Arial" w:eastAsia="Arial" w:hAnsi="Arial"/>
+                    <w:sz w:val="22"/>
+                    <w:szCs w:val="22"/>
+                    <w:rtl w:val="0"/>
+                  </w:rPr>
+                  <w:t xml:space="preserve">Read pages 63 - 80</w:t>
                 </w:r>
               </w:p>
             </w:tc>
@@ -3890,7 +3949,26 @@
                     <w:szCs w:val="22"/>
                     <w:rtl w:val="0"/>
                   </w:rPr>
-                  <w:t xml:space="preserve">Conceptual Figure (due Friday)</w:t>
+                  <w:t xml:space="preserve">Conceptual Figure (due Friday),</w:t>
+                </w:r>
+              </w:p>
+              <w:p>
+                <w:pPr>
+                  <w:widowControl w:val="0"/>
+                  <w:rPr>
+                    <w:rFonts w:ascii="Arial" w:cs="Arial" w:eastAsia="Arial" w:hAnsi="Arial"/>
+                    <w:sz w:val="22"/>
+                    <w:szCs w:val="22"/>
+                  </w:rPr>
+                </w:pPr>
+                <w:r>
+                  <w:rPr>
+                    <w:rFonts w:ascii="Arial" w:cs="Arial" w:eastAsia="Arial" w:hAnsi="Arial"/>
+                    <w:sz w:val="22"/>
+                    <w:szCs w:val="22"/>
+                    <w:rtl w:val="0"/>
+                  </w:rPr>
+                  <w:t xml:space="preserve">Read pages 81 - 117</w:t>
                 </w:r>
               </w:p>
             </w:tc>
@@ -3992,8 +4070,12 @@
                 </w:pPr>
                 <w:r>
                   <w:rPr>
-                    <w:rtl w:val="0"/>
-                  </w:rPr>
+                    <w:rFonts w:ascii="Arial" w:cs="Arial" w:eastAsia="Arial" w:hAnsi="Arial"/>
+                    <w:sz w:val="22"/>
+                    <w:szCs w:val="22"/>
+                    <w:rtl w:val="0"/>
+                  </w:rPr>
+                  <w:t xml:space="preserve">Read pages 118 - 140</w:t>
                 </w:r>
               </w:p>
             </w:tc>
@@ -4082,16 +4164,18 @@
                   <w:widowControl w:val="0"/>
                   <w:rPr>
                     <w:rFonts w:ascii="Arial" w:cs="Arial" w:eastAsia="Arial" w:hAnsi="Arial"/>
-                    <w:b w:val="1"/>
-                    <w:bCs w:val="1"/>
-                    <w:sz w:val="22"/>
-                    <w:szCs w:val="22"/>
-                  </w:rPr>
-                </w:pPr>
-                <w:r>
-                  <w:rPr>
-                    <w:rtl w:val="0"/>
-                  </w:rPr>
+                    <w:sz w:val="22"/>
+                    <w:szCs w:val="22"/>
+                  </w:rPr>
+                </w:pPr>
+                <w:r>
+                  <w:rPr>
+                    <w:rFonts w:ascii="Arial" w:cs="Arial" w:eastAsia="Arial" w:hAnsi="Arial"/>
+                    <w:sz w:val="22"/>
+                    <w:szCs w:val="22"/>
+                    <w:rtl w:val="0"/>
+                  </w:rPr>
+                  <w:t xml:space="preserve">Read pages 141 - 157</w:t>
                 </w:r>
               </w:p>
             </w:tc>
@@ -4224,16 +4308,18 @@
                   <w:widowControl w:val="0"/>
                   <w:rPr>
                     <w:rFonts w:ascii="Arial" w:cs="Arial" w:eastAsia="Arial" w:hAnsi="Arial"/>
-                    <w:b w:val="1"/>
-                    <w:bCs w:val="1"/>
-                    <w:sz w:val="22"/>
-                    <w:szCs w:val="22"/>
-                  </w:rPr>
-                </w:pPr>
-                <w:r>
-                  <w:rPr>
-                    <w:rtl w:val="0"/>
-                  </w:rPr>
+                    <w:sz w:val="22"/>
+                    <w:szCs w:val="22"/>
+                  </w:rPr>
+                </w:pPr>
+                <w:r>
+                  <w:rPr>
+                    <w:rFonts w:ascii="Arial" w:cs="Arial" w:eastAsia="Arial" w:hAnsi="Arial"/>
+                    <w:sz w:val="22"/>
+                    <w:szCs w:val="22"/>
+                    <w:rtl w:val="0"/>
+                  </w:rPr>
+                  <w:t xml:space="preserve">Read pages 158 - 176</w:t>
                 </w:r>
               </w:p>
             </w:tc>
@@ -4458,8 +4544,12 @@
                 </w:pPr>
                 <w:r>
                   <w:rPr>
-                    <w:rtl w:val="0"/>
-                  </w:rPr>
+                    <w:rFonts w:ascii="Arial" w:cs="Arial" w:eastAsia="Arial" w:hAnsi="Arial"/>
+                    <w:sz w:val="22"/>
+                    <w:szCs w:val="22"/>
+                    <w:rtl w:val="0"/>
+                  </w:rPr>
+                  <w:t xml:space="preserve">Assigned readings</w:t>
                 </w:r>
               </w:p>
             </w:tc>
@@ -4572,6 +4662,15 @@
                     <w:szCs w:val="22"/>
                   </w:rPr>
                 </w:pPr>
+                <w:r>
+                  <w:rPr>
+                    <w:rFonts w:ascii="Arial" w:cs="Arial" w:eastAsia="Arial" w:hAnsi="Arial"/>
+                    <w:sz w:val="22"/>
+                    <w:szCs w:val="22"/>
+                    <w:rtl w:val="0"/>
+                  </w:rPr>
+                  <w:t xml:space="preserve">Assigned readings</w:t>
+                </w:r>
                 <w:r>
                   <w:rPr>
                     <w:rtl w:val="0"/>

</xml_diff>

<commit_message>
Added suggested readings to syllabus
</commit_message>
<xml_diff>
--- a/syllabus/Community Ecology Syllabus 2026.docx
+++ b/syllabus/Community Ecology Syllabus 2026.docx
@@ -2313,7 +2313,7 @@
     <w:sdt>
       <w:sdtPr>
         <w:lock w:val="contentLocked"/>
-        <w:id w:val="280246434"/>
+        <w:id w:val="264989730"/>
         <w:tag w:val="goog_rdk_0"/>
       </w:sdtPr>
       <w:sdtContent>
@@ -4818,16 +4818,18 @@
                   <w:widowControl w:val="0"/>
                   <w:rPr>
                     <w:rFonts w:ascii="Arial" w:cs="Arial" w:eastAsia="Arial" w:hAnsi="Arial"/>
-                    <w:b w:val="1"/>
-                    <w:bCs w:val="1"/>
-                    <w:sz w:val="22"/>
-                    <w:szCs w:val="22"/>
-                  </w:rPr>
-                </w:pPr>
-                <w:r>
-                  <w:rPr>
-                    <w:rtl w:val="0"/>
-                  </w:rPr>
+                    <w:sz w:val="22"/>
+                    <w:szCs w:val="22"/>
+                  </w:rPr>
+                </w:pPr>
+                <w:r>
+                  <w:rPr>
+                    <w:rFonts w:ascii="Arial" w:cs="Arial" w:eastAsia="Arial" w:hAnsi="Arial"/>
+                    <w:sz w:val="22"/>
+                    <w:szCs w:val="22"/>
+                    <w:rtl w:val="0"/>
+                  </w:rPr>
+                  <w:t xml:space="preserve">Read pages 231 - 233</w:t>
                 </w:r>
               </w:p>
             </w:tc>
@@ -4983,25 +4985,41 @@
                   <w:widowControl w:val="0"/>
                   <w:rPr>
                     <w:rFonts w:ascii="Arial" w:cs="Arial" w:eastAsia="Arial" w:hAnsi="Arial"/>
-                    <w:sz w:val="22"/>
-                    <w:szCs w:val="22"/>
-                  </w:rPr>
-                </w:pPr>
-                <w:r>
-                  <w:rPr>
-                    <w:rFonts w:ascii="Arial" w:cs="Arial" w:eastAsia="Arial" w:hAnsi="Arial"/>
                     <w:b w:val="1"/>
                     <w:bCs w:val="1"/>
                     <w:sz w:val="22"/>
                     <w:szCs w:val="22"/>
-                    <w:rtl w:val="0"/>
-                  </w:rPr>
-                  <w:t xml:space="preserve">Network Assignment (due Friday)</w:t>
-                </w:r>
-                <w:r>
-                  <w:rPr>
-                    <w:rtl w:val="0"/>
-                  </w:rPr>
+                  </w:rPr>
+                </w:pPr>
+                <w:r>
+                  <w:rPr>
+                    <w:rFonts w:ascii="Arial" w:cs="Arial" w:eastAsia="Arial" w:hAnsi="Arial"/>
+                    <w:b w:val="1"/>
+                    <w:bCs w:val="1"/>
+                    <w:sz w:val="22"/>
+                    <w:szCs w:val="22"/>
+                    <w:rtl w:val="0"/>
+                  </w:rPr>
+                  <w:t xml:space="preserve">Network Assignment (due Friday),</w:t>
+                </w:r>
+              </w:p>
+              <w:p>
+                <w:pPr>
+                  <w:widowControl w:val="0"/>
+                  <w:rPr>
+                    <w:rFonts w:ascii="Arial" w:cs="Arial" w:eastAsia="Arial" w:hAnsi="Arial"/>
+                    <w:sz w:val="22"/>
+                    <w:szCs w:val="22"/>
+                  </w:rPr>
+                </w:pPr>
+                <w:r>
+                  <w:rPr>
+                    <w:rFonts w:ascii="Arial" w:cs="Arial" w:eastAsia="Arial" w:hAnsi="Arial"/>
+                    <w:sz w:val="22"/>
+                    <w:szCs w:val="22"/>
+                    <w:rtl w:val="0"/>
+                  </w:rPr>
+                  <w:t xml:space="preserve">Read pages 233 - 236</w:t>
                 </w:r>
               </w:p>
             </w:tc>
@@ -5572,16 +5590,18 @@
                   <w:widowControl w:val="0"/>
                   <w:rPr>
                     <w:rFonts w:ascii="Arial" w:cs="Arial" w:eastAsia="Arial" w:hAnsi="Arial"/>
-                    <w:b w:val="1"/>
-                    <w:bCs w:val="1"/>
-                    <w:sz w:val="22"/>
-                    <w:szCs w:val="22"/>
-                  </w:rPr>
-                </w:pPr>
-                <w:r>
-                  <w:rPr>
-                    <w:rtl w:val="0"/>
-                  </w:rPr>
+                    <w:sz w:val="22"/>
+                    <w:szCs w:val="22"/>
+                  </w:rPr>
+                </w:pPr>
+                <w:r>
+                  <w:rPr>
+                    <w:rFonts w:ascii="Arial" w:cs="Arial" w:eastAsia="Arial" w:hAnsi="Arial"/>
+                    <w:sz w:val="22"/>
+                    <w:szCs w:val="22"/>
+                    <w:rtl w:val="0"/>
+                  </w:rPr>
+                  <w:t xml:space="preserve">Read page 236</w:t>
                 </w:r>
               </w:p>
             </w:tc>
@@ -5699,16 +5719,18 @@
                   <w:widowControl w:val="0"/>
                   <w:rPr>
                     <w:rFonts w:ascii="Arial" w:cs="Arial" w:eastAsia="Arial" w:hAnsi="Arial"/>
-                    <w:b w:val="1"/>
-                    <w:bCs w:val="1"/>
-                    <w:sz w:val="22"/>
-                    <w:szCs w:val="22"/>
-                  </w:rPr>
-                </w:pPr>
-                <w:r>
-                  <w:rPr>
-                    <w:rtl w:val="0"/>
-                  </w:rPr>
+                    <w:sz w:val="22"/>
+                    <w:szCs w:val="22"/>
+                  </w:rPr>
+                </w:pPr>
+                <w:r>
+                  <w:rPr>
+                    <w:rFonts w:ascii="Arial" w:cs="Arial" w:eastAsia="Arial" w:hAnsi="Arial"/>
+                    <w:sz w:val="22"/>
+                    <w:szCs w:val="22"/>
+                    <w:rtl w:val="0"/>
+                  </w:rPr>
+                  <w:t xml:space="preserve">Read pages 236 - 246</w:t>
                 </w:r>
               </w:p>
             </w:tc>
@@ -5826,8 +5848,6 @@
                   <w:widowControl w:val="0"/>
                   <w:rPr>
                     <w:rFonts w:ascii="Arial" w:cs="Arial" w:eastAsia="Arial" w:hAnsi="Arial"/>
-                    <w:b w:val="1"/>
-                    <w:bCs w:val="1"/>
                     <w:sz w:val="22"/>
                     <w:szCs w:val="22"/>
                   </w:rPr>
@@ -6131,16 +6151,18 @@
                   <w:widowControl w:val="0"/>
                   <w:rPr>
                     <w:rFonts w:ascii="Arial" w:cs="Arial" w:eastAsia="Arial" w:hAnsi="Arial"/>
-                    <w:b w:val="1"/>
-                    <w:bCs w:val="1"/>
-                    <w:sz w:val="22"/>
-                    <w:szCs w:val="22"/>
-                  </w:rPr>
-                </w:pPr>
-                <w:r>
-                  <w:rPr>
-                    <w:rtl w:val="0"/>
-                  </w:rPr>
+                    <w:sz w:val="22"/>
+                    <w:szCs w:val="22"/>
+                  </w:rPr>
+                </w:pPr>
+                <w:r>
+                  <w:rPr>
+                    <w:rFonts w:ascii="Arial" w:cs="Arial" w:eastAsia="Arial" w:hAnsi="Arial"/>
+                    <w:sz w:val="22"/>
+                    <w:szCs w:val="22"/>
+                    <w:rtl w:val="0"/>
+                  </w:rPr>
+                  <w:t xml:space="preserve">Read pages 249 - 257</w:t>
                 </w:r>
               </w:p>
             </w:tc>
@@ -6258,16 +6280,18 @@
                   <w:widowControl w:val="0"/>
                   <w:rPr>
                     <w:rFonts w:ascii="Arial" w:cs="Arial" w:eastAsia="Arial" w:hAnsi="Arial"/>
-                    <w:b w:val="1"/>
-                    <w:bCs w:val="1"/>
-                    <w:sz w:val="22"/>
-                    <w:szCs w:val="22"/>
-                  </w:rPr>
-                </w:pPr>
-                <w:r>
-                  <w:rPr>
-                    <w:rtl w:val="0"/>
-                  </w:rPr>
+                    <w:sz w:val="22"/>
+                    <w:szCs w:val="22"/>
+                  </w:rPr>
+                </w:pPr>
+                <w:r>
+                  <w:rPr>
+                    <w:rFonts w:ascii="Arial" w:cs="Arial" w:eastAsia="Arial" w:hAnsi="Arial"/>
+                    <w:sz w:val="22"/>
+                    <w:szCs w:val="22"/>
+                    <w:rtl w:val="0"/>
+                  </w:rPr>
+                  <w:t xml:space="preserve">Read pages 257 - 265</w:t>
                 </w:r>
               </w:p>
             </w:tc>
@@ -6416,16 +6440,18 @@
                   <w:widowControl w:val="0"/>
                   <w:rPr>
                     <w:rFonts w:ascii="Arial" w:cs="Arial" w:eastAsia="Arial" w:hAnsi="Arial"/>
-                    <w:b w:val="1"/>
-                    <w:bCs w:val="1"/>
-                    <w:sz w:val="22"/>
-                    <w:szCs w:val="22"/>
-                  </w:rPr>
-                </w:pPr>
-                <w:r>
-                  <w:rPr>
-                    <w:rtl w:val="0"/>
-                  </w:rPr>
+                    <w:sz w:val="22"/>
+                    <w:szCs w:val="22"/>
+                  </w:rPr>
+                </w:pPr>
+                <w:r>
+                  <w:rPr>
+                    <w:rFonts w:ascii="Arial" w:cs="Arial" w:eastAsia="Arial" w:hAnsi="Arial"/>
+                    <w:sz w:val="22"/>
+                    <w:szCs w:val="22"/>
+                    <w:rtl w:val="0"/>
+                  </w:rPr>
+                  <w:t xml:space="preserve">Read pages 266 - 274</w:t>
                 </w:r>
               </w:p>
             </w:tc>
@@ -6543,16 +6569,18 @@
                   <w:widowControl w:val="0"/>
                   <w:rPr>
                     <w:rFonts w:ascii="Arial" w:cs="Arial" w:eastAsia="Arial" w:hAnsi="Arial"/>
-                    <w:b w:val="1"/>
-                    <w:bCs w:val="1"/>
-                    <w:sz w:val="22"/>
-                    <w:szCs w:val="22"/>
-                  </w:rPr>
-                </w:pPr>
-                <w:r>
-                  <w:rPr>
-                    <w:rtl w:val="0"/>
-                  </w:rPr>
+                    <w:sz w:val="22"/>
+                    <w:szCs w:val="22"/>
+                  </w:rPr>
+                </w:pPr>
+                <w:r>
+                  <w:rPr>
+                    <w:rFonts w:ascii="Arial" w:cs="Arial" w:eastAsia="Arial" w:hAnsi="Arial"/>
+                    <w:sz w:val="22"/>
+                    <w:szCs w:val="22"/>
+                    <w:rtl w:val="0"/>
+                  </w:rPr>
+                  <w:t xml:space="preserve">Read pages 274 - 284</w:t>
                 </w:r>
               </w:p>
             </w:tc>
@@ -6677,16 +6705,18 @@
                   <w:widowControl w:val="0"/>
                   <w:rPr>
                     <w:rFonts w:ascii="Arial" w:cs="Arial" w:eastAsia="Arial" w:hAnsi="Arial"/>
-                    <w:b w:val="1"/>
-                    <w:bCs w:val="1"/>
-                    <w:sz w:val="22"/>
-                    <w:szCs w:val="22"/>
-                  </w:rPr>
-                </w:pPr>
-                <w:r>
-                  <w:rPr>
-                    <w:rtl w:val="0"/>
-                  </w:rPr>
+                    <w:sz w:val="22"/>
+                    <w:szCs w:val="22"/>
+                  </w:rPr>
+                </w:pPr>
+                <w:r>
+                  <w:rPr>
+                    <w:rFonts w:ascii="Arial" w:cs="Arial" w:eastAsia="Arial" w:hAnsi="Arial"/>
+                    <w:sz w:val="22"/>
+                    <w:szCs w:val="22"/>
+                    <w:rtl w:val="0"/>
+                  </w:rPr>
+                  <w:t xml:space="preserve">Read pages 287 - 306</w:t>
                 </w:r>
               </w:p>
             </w:tc>

</xml_diff>